<commit_message>
sql assignment are done
</commit_message>
<xml_diff>
--- a/MYSQL/Demo/13_Group_By and Order_By.docx
+++ b/MYSQL/Demo/13_Group_By and Order_By.docx
@@ -21,19 +21,7 @@
           <w:szCs w:val="40"/>
           <w:lang w:val="en-US"/>
         </w:rPr>
-        <w:t>SQL QUESTIONS AND Q</w:t>
-      </w:r>
-      <w:bookmarkStart w:id="0" w:name="_GoBack"/>
-      <w:bookmarkEnd w:id="0"/>
-      <w:r>
-        <w:rPr>
-          <w:b/>
-          <w:bCs/>
-          <w:sz w:val="40"/>
-          <w:szCs w:val="40"/>
-          <w:lang w:val="en-US"/>
-        </w:rPr>
-        <w:t>UERIES</w:t>
+        <w:t>SQL QUESTIONS AND QUERIES</w:t>
       </w:r>
     </w:p>
     <w:p>
@@ -336,10 +324,10 @@
           <w:lang w:eastAsia="en-IN" w:bidi="mr-IN"/>
         </w:rPr>
         <w:drawing>
-          <wp:inline distT="0" distB="0" distL="0" distR="0" wp14:anchorId="21C8B8F0" wp14:editId="5309A78E">
-            <wp:extent cx="5731510" cy="1446835"/>
-            <wp:effectExtent l="0" t="0" r="2540" b="1270"/>
-            <wp:docPr id="2" name="Picture 2"/>
+          <wp:inline distT="0" distB="0" distL="0" distR="0" wp14:anchorId="50B73402" wp14:editId="61C1F93E">
+            <wp:extent cx="5731510" cy="2670175"/>
+            <wp:effectExtent l="0" t="0" r="2540" b="0"/>
+            <wp:docPr id="11" name="Picture 11"/>
             <wp:cNvGraphicFramePr>
               <a:graphicFrameLocks xmlns:a="http://schemas.openxmlformats.org/drawingml/2006/main" noChangeAspect="1"/>
             </wp:cNvGraphicFramePr>
@@ -359,7 +347,7 @@
                   <pic:spPr>
                     <a:xfrm>
                       <a:off x="0" y="0"/>
-                      <a:ext cx="5736776" cy="1448164"/>
+                      <a:ext cx="5731510" cy="2670175"/>
                     </a:xfrm>
                     <a:prstGeom prst="rect">
                       <a:avLst/>
@@ -371,79 +359,8 @@
           </wp:inline>
         </w:drawing>
       </w:r>
-    </w:p>
-    <w:p>
-      <w:pPr>
-        <w:spacing w:after="0" w:line="240" w:lineRule="auto"/>
-        <w:rPr>
-          <w:rFonts w:ascii="Times New Roman" w:eastAsia="Times New Roman" w:hAnsi="Times New Roman" w:cs="Times New Roman"/>
-          <w:sz w:val="24"/>
-          <w:szCs w:val="24"/>
-          <w:lang w:eastAsia="en-IN" w:bidi="mr-IN"/>
-        </w:rPr>
-      </w:pPr>
-      <w:proofErr w:type="gramStart"/>
-      <w:r>
-        <w:rPr>
-          <w:rFonts w:ascii="Times New Roman" w:eastAsia="Times New Roman" w:hAnsi="Symbol" w:cs="Times New Roman"/>
-          <w:sz w:val="24"/>
-          <w:szCs w:val="24"/>
-          <w:lang w:eastAsia="en-IN" w:bidi="mr-IN"/>
-        </w:rPr>
-        <w:t></w:t>
-      </w:r>
-      <w:r>
-        <w:rPr>
-          <w:rFonts w:ascii="Times New Roman" w:eastAsia="Times New Roman" w:hAnsi="Times New Roman" w:cs="Times New Roman"/>
-          <w:sz w:val="24"/>
-          <w:szCs w:val="24"/>
-          <w:lang w:eastAsia="en-IN" w:bidi="mr-IN"/>
-        </w:rPr>
-        <w:t xml:space="preserve">  </w:t>
-      </w:r>
-      <w:r>
-        <w:rPr>
-          <w:rFonts w:ascii="Times New Roman" w:eastAsia="Times New Roman" w:hAnsi="Times New Roman" w:cs="Times New Roman"/>
-          <w:b/>
-          <w:bCs/>
-          <w:sz w:val="24"/>
-          <w:szCs w:val="24"/>
-          <w:lang w:eastAsia="en-IN" w:bidi="mr-IN"/>
-        </w:rPr>
-        <w:t>Find</w:t>
-      </w:r>
-      <w:proofErr w:type="gramEnd"/>
-      <w:r>
-        <w:rPr>
-          <w:rFonts w:ascii="Times New Roman" w:eastAsia="Times New Roman" w:hAnsi="Times New Roman" w:cs="Times New Roman"/>
-          <w:b/>
-          <w:bCs/>
-          <w:sz w:val="24"/>
-          <w:szCs w:val="24"/>
-          <w:lang w:eastAsia="en-IN" w:bidi="mr-IN"/>
-        </w:rPr>
-        <w:t xml:space="preserve"> the maximum salary in each department.</w:t>
-      </w:r>
-      <w:r>
-        <w:rPr>
-          <w:rFonts w:ascii="Times New Roman" w:eastAsia="Times New Roman" w:hAnsi="Times New Roman" w:cs="Times New Roman"/>
-          <w:sz w:val="24"/>
-          <w:szCs w:val="24"/>
-          <w:lang w:eastAsia="en-IN" w:bidi="mr-IN"/>
-        </w:rPr>
-        <w:t xml:space="preserve"> </w:t>
-      </w:r>
-    </w:p>
-    <w:p>
-      <w:pPr>
-        <w:spacing w:after="0" w:line="240" w:lineRule="auto"/>
-        <w:rPr>
-          <w:rFonts w:ascii="Times New Roman" w:eastAsia="Times New Roman" w:hAnsi="Times New Roman" w:cs="Times New Roman"/>
-          <w:sz w:val="24"/>
-          <w:szCs w:val="24"/>
-          <w:lang w:eastAsia="en-IN" w:bidi="mr-IN"/>
-        </w:rPr>
-      </w:pPr>
+      <w:bookmarkStart w:id="0" w:name="_GoBack"/>
+      <w:bookmarkEnd w:id="0"/>
       <w:r>
         <w:rPr>
           <w:rFonts w:ascii="Times New Roman" w:eastAsia="Times New Roman" w:hAnsi="Times New Roman" w:cs="Times New Roman"/>
@@ -453,10 +370,10 @@
           <w:lang w:eastAsia="en-IN" w:bidi="mr-IN"/>
         </w:rPr>
         <w:drawing>
-          <wp:inline distT="0" distB="0" distL="0" distR="0" wp14:anchorId="3442B343" wp14:editId="4E55F281">
-            <wp:extent cx="5731510" cy="1279003"/>
-            <wp:effectExtent l="0" t="0" r="2540" b="0"/>
-            <wp:docPr id="3" name="Picture 3"/>
+          <wp:inline distT="0" distB="0" distL="0" distR="0" wp14:anchorId="21C8B8F0" wp14:editId="5309A78E">
+            <wp:extent cx="5731510" cy="1446835"/>
+            <wp:effectExtent l="0" t="0" r="2540" b="1270"/>
+            <wp:docPr id="2" name="Picture 2"/>
             <wp:cNvGraphicFramePr>
               <a:graphicFrameLocks xmlns:a="http://schemas.openxmlformats.org/drawingml/2006/main" noChangeAspect="1"/>
             </wp:cNvGraphicFramePr>
@@ -476,7 +393,7 @@
                   <pic:spPr>
                     <a:xfrm>
                       <a:off x="0" y="0"/>
-                      <a:ext cx="5737497" cy="1280339"/>
+                      <a:ext cx="5736776" cy="1448164"/>
                     </a:xfrm>
                     <a:prstGeom prst="rect">
                       <a:avLst/>
@@ -527,7 +444,7 @@
           <w:szCs w:val="24"/>
           <w:lang w:eastAsia="en-IN" w:bidi="mr-IN"/>
         </w:rPr>
-        <w:t>Display</w:t>
+        <w:t>Find</w:t>
       </w:r>
       <w:proofErr w:type="gramEnd"/>
       <w:r>
@@ -539,7 +456,7 @@
           <w:szCs w:val="24"/>
           <w:lang w:eastAsia="en-IN" w:bidi="mr-IN"/>
         </w:rPr>
-        <w:t xml:space="preserve"> the number of employees based on gender.</w:t>
+        <w:t xml:space="preserve"> the maximum salary in each department.</w:t>
       </w:r>
       <w:r>
         <w:rPr>
@@ -570,10 +487,10 @@
           <w:lang w:eastAsia="en-IN" w:bidi="mr-IN"/>
         </w:rPr>
         <w:drawing>
-          <wp:inline distT="0" distB="0" distL="0" distR="0" wp14:anchorId="130E9552" wp14:editId="0EDAC596">
-            <wp:extent cx="5731445" cy="1192192"/>
-            <wp:effectExtent l="0" t="0" r="3175" b="8255"/>
-            <wp:docPr id="4" name="Picture 4"/>
+          <wp:inline distT="0" distB="0" distL="0" distR="0" wp14:anchorId="3442B343" wp14:editId="4E55F281">
+            <wp:extent cx="5731510" cy="1279003"/>
+            <wp:effectExtent l="0" t="0" r="2540" b="0"/>
+            <wp:docPr id="3" name="Picture 3"/>
             <wp:cNvGraphicFramePr>
               <a:graphicFrameLocks xmlns:a="http://schemas.openxmlformats.org/drawingml/2006/main" noChangeAspect="1"/>
             </wp:cNvGraphicFramePr>
@@ -593,7 +510,7 @@
                   <pic:spPr>
                     <a:xfrm>
                       <a:off x="0" y="0"/>
-                      <a:ext cx="5740957" cy="1194170"/>
+                      <a:ext cx="5737497" cy="1280339"/>
                     </a:xfrm>
                     <a:prstGeom prst="rect">
                       <a:avLst/>
@@ -644,7 +561,7 @@
           <w:szCs w:val="24"/>
           <w:lang w:eastAsia="en-IN" w:bidi="mr-IN"/>
         </w:rPr>
-        <w:t>Find</w:t>
+        <w:t>Display</w:t>
       </w:r>
       <w:proofErr w:type="gramEnd"/>
       <w:r>
@@ -656,7 +573,7 @@
           <w:szCs w:val="24"/>
           <w:lang w:eastAsia="en-IN" w:bidi="mr-IN"/>
         </w:rPr>
-        <w:t xml:space="preserve"> the number of employees in each age group.</w:t>
+        <w:t xml:space="preserve"> the number of employees based on gender.</w:t>
       </w:r>
       <w:r>
         <w:rPr>
@@ -686,11 +603,12 @@
           <w:szCs w:val="24"/>
           <w:lang w:eastAsia="en-IN" w:bidi="mr-IN"/>
         </w:rPr>
+        <w:lastRenderedPageBreak/>
         <w:drawing>
-          <wp:inline distT="0" distB="0" distL="0" distR="0" wp14:anchorId="5FB089A6" wp14:editId="447DBE2E">
-            <wp:extent cx="5729970" cy="1539433"/>
-            <wp:effectExtent l="0" t="0" r="4445" b="3810"/>
-            <wp:docPr id="5" name="Picture 5"/>
+          <wp:inline distT="0" distB="0" distL="0" distR="0" wp14:anchorId="130E9552" wp14:editId="0EDAC596">
+            <wp:extent cx="5731445" cy="1192192"/>
+            <wp:effectExtent l="0" t="0" r="3175" b="8255"/>
+            <wp:docPr id="4" name="Picture 4"/>
             <wp:cNvGraphicFramePr>
               <a:graphicFrameLocks xmlns:a="http://schemas.openxmlformats.org/drawingml/2006/main" noChangeAspect="1"/>
             </wp:cNvGraphicFramePr>
@@ -710,7 +628,7 @@
                   <pic:spPr>
                     <a:xfrm>
                       <a:off x="0" y="0"/>
-                      <a:ext cx="5744972" cy="1543464"/>
+                      <a:ext cx="5740957" cy="1194170"/>
                     </a:xfrm>
                     <a:prstGeom prst="rect">
                       <a:avLst/>
@@ -741,7 +659,6 @@
           <w:szCs w:val="24"/>
           <w:lang w:eastAsia="en-IN" w:bidi="mr-IN"/>
         </w:rPr>
-        <w:lastRenderedPageBreak/>
         <w:t></w:t>
       </w:r>
       <w:r>
@@ -774,7 +691,7 @@
           <w:szCs w:val="24"/>
           <w:lang w:eastAsia="en-IN" w:bidi="mr-IN"/>
         </w:rPr>
-        <w:t xml:space="preserve"> the average salary of employees in each department.</w:t>
+        <w:t xml:space="preserve"> the number of employees in each age group.</w:t>
       </w:r>
       <w:r>
         <w:rPr>
@@ -805,10 +722,10 @@
           <w:lang w:eastAsia="en-IN" w:bidi="mr-IN"/>
         </w:rPr>
         <w:drawing>
-          <wp:inline distT="0" distB="0" distL="0" distR="0" wp14:anchorId="5F936C9A" wp14:editId="22C39B0E">
-            <wp:extent cx="5730225" cy="1325301"/>
-            <wp:effectExtent l="0" t="0" r="4445" b="8255"/>
-            <wp:docPr id="6" name="Picture 6"/>
+          <wp:inline distT="0" distB="0" distL="0" distR="0" wp14:anchorId="5FB089A6" wp14:editId="447DBE2E">
+            <wp:extent cx="5729970" cy="1539433"/>
+            <wp:effectExtent l="0" t="0" r="4445" b="3810"/>
+            <wp:docPr id="5" name="Picture 5"/>
             <wp:cNvGraphicFramePr>
               <a:graphicFrameLocks xmlns:a="http://schemas.openxmlformats.org/drawingml/2006/main" noChangeAspect="1"/>
             </wp:cNvGraphicFramePr>
@@ -828,7 +745,7 @@
                   <pic:spPr>
                     <a:xfrm>
                       <a:off x="0" y="0"/>
-                      <a:ext cx="5751274" cy="1330169"/>
+                      <a:ext cx="5744972" cy="1543464"/>
                     </a:xfrm>
                     <a:prstGeom prst="rect">
                       <a:avLst/>
@@ -879,7 +796,7 @@
           <w:szCs w:val="24"/>
           <w:lang w:eastAsia="en-IN" w:bidi="mr-IN"/>
         </w:rPr>
-        <w:t>Display</w:t>
+        <w:t>Find</w:t>
       </w:r>
       <w:proofErr w:type="gramEnd"/>
       <w:r>
@@ -891,7 +808,7 @@
           <w:szCs w:val="24"/>
           <w:lang w:eastAsia="en-IN" w:bidi="mr-IN"/>
         </w:rPr>
-        <w:t xml:space="preserve"> departments whose average salary is greater than 30000.</w:t>
+        <w:t xml:space="preserve"> the average salary of employees in each department.</w:t>
       </w:r>
       <w:r>
         <w:rPr>
@@ -922,10 +839,10 @@
           <w:lang w:eastAsia="en-IN" w:bidi="mr-IN"/>
         </w:rPr>
         <w:drawing>
-          <wp:inline distT="0" distB="0" distL="0" distR="0" wp14:anchorId="003CF95D" wp14:editId="0ADCD139">
-            <wp:extent cx="5730240" cy="1174830"/>
-            <wp:effectExtent l="0" t="0" r="3810" b="6350"/>
-            <wp:docPr id="7" name="Picture 7"/>
+          <wp:inline distT="0" distB="0" distL="0" distR="0" wp14:anchorId="5F936C9A" wp14:editId="22C39B0E">
+            <wp:extent cx="5730225" cy="1325301"/>
+            <wp:effectExtent l="0" t="0" r="4445" b="8255"/>
+            <wp:docPr id="6" name="Picture 6"/>
             <wp:cNvGraphicFramePr>
               <a:graphicFrameLocks xmlns:a="http://schemas.openxmlformats.org/drawingml/2006/main" noChangeAspect="1"/>
             </wp:cNvGraphicFramePr>
@@ -945,7 +862,7 @@
                   <pic:spPr>
                     <a:xfrm>
                       <a:off x="0" y="0"/>
-                      <a:ext cx="5746542" cy="1178172"/>
+                      <a:ext cx="5751274" cy="1330169"/>
                     </a:xfrm>
                     <a:prstGeom prst="rect">
                       <a:avLst/>
@@ -1008,7 +925,7 @@
           <w:szCs w:val="24"/>
           <w:lang w:eastAsia="en-IN" w:bidi="mr-IN"/>
         </w:rPr>
-        <w:t xml:space="preserve"> departments 1 and 2 with their average salary.</w:t>
+        <w:t xml:space="preserve"> departments whose average salary is greater than 30000.</w:t>
       </w:r>
       <w:r>
         <w:rPr>
@@ -1039,10 +956,10 @@
           <w:lang w:eastAsia="en-IN" w:bidi="mr-IN"/>
         </w:rPr>
         <w:drawing>
-          <wp:inline distT="0" distB="0" distL="0" distR="0" wp14:anchorId="5E0E171F" wp14:editId="584A94B0">
-            <wp:extent cx="5726398" cy="1238492"/>
-            <wp:effectExtent l="0" t="0" r="8255" b="0"/>
-            <wp:docPr id="8" name="Picture 8"/>
+          <wp:inline distT="0" distB="0" distL="0" distR="0" wp14:anchorId="003CF95D" wp14:editId="0ADCD139">
+            <wp:extent cx="5730240" cy="1174830"/>
+            <wp:effectExtent l="0" t="0" r="3810" b="6350"/>
+            <wp:docPr id="7" name="Picture 7"/>
             <wp:cNvGraphicFramePr>
               <a:graphicFrameLocks xmlns:a="http://schemas.openxmlformats.org/drawingml/2006/main" noChangeAspect="1"/>
             </wp:cNvGraphicFramePr>
@@ -1062,7 +979,7 @@
                   <pic:spPr>
                     <a:xfrm>
                       <a:off x="0" y="0"/>
-                      <a:ext cx="5766752" cy="1247220"/>
+                      <a:ext cx="5746542" cy="1178172"/>
                     </a:xfrm>
                     <a:prstGeom prst="rect">
                       <a:avLst/>
@@ -1125,7 +1042,7 @@
           <w:szCs w:val="24"/>
           <w:lang w:eastAsia="en-IN" w:bidi="mr-IN"/>
         </w:rPr>
-        <w:t xml:space="preserve"> departments that have at least 2 employees.</w:t>
+        <w:t xml:space="preserve"> departments 1 and 2 with their average salary.</w:t>
       </w:r>
       <w:r>
         <w:rPr>
@@ -1156,10 +1073,10 @@
           <w:lang w:eastAsia="en-IN" w:bidi="mr-IN"/>
         </w:rPr>
         <w:drawing>
-          <wp:inline distT="0" distB="0" distL="0" distR="0" wp14:anchorId="1877DD5E" wp14:editId="05EFEC2D">
-            <wp:extent cx="5725834" cy="1319514"/>
-            <wp:effectExtent l="0" t="0" r="0" b="0"/>
-            <wp:docPr id="9" name="Picture 9"/>
+          <wp:inline distT="0" distB="0" distL="0" distR="0" wp14:anchorId="5E0E171F" wp14:editId="584A94B0">
+            <wp:extent cx="5726398" cy="1238492"/>
+            <wp:effectExtent l="0" t="0" r="8255" b="0"/>
+            <wp:docPr id="8" name="Picture 8"/>
             <wp:cNvGraphicFramePr>
               <a:graphicFrameLocks xmlns:a="http://schemas.openxmlformats.org/drawingml/2006/main" noChangeAspect="1"/>
             </wp:cNvGraphicFramePr>
@@ -1179,7 +1096,7 @@
                   <pic:spPr>
                     <a:xfrm>
                       <a:off x="0" y="0"/>
-                      <a:ext cx="5786978" cy="1333605"/>
+                      <a:ext cx="5766752" cy="1247220"/>
                     </a:xfrm>
                     <a:prstGeom prst="rect">
                       <a:avLst/>
@@ -1242,7 +1159,7 @@
           <w:szCs w:val="24"/>
           <w:lang w:eastAsia="en-IN" w:bidi="mr-IN"/>
         </w:rPr>
-        <w:t xml:space="preserve"> departments 1 and 2 whose average salary is greater than 30000.</w:t>
+        <w:t xml:space="preserve"> departments that have at least 2 employees.</w:t>
       </w:r>
       <w:r>
         <w:rPr>
@@ -1273,10 +1190,10 @@
           <w:lang w:eastAsia="en-IN" w:bidi="mr-IN"/>
         </w:rPr>
         <w:drawing>
-          <wp:inline distT="0" distB="0" distL="0" distR="0" wp14:anchorId="1E3F903A" wp14:editId="76A8890C">
-            <wp:extent cx="5730040" cy="1209554"/>
-            <wp:effectExtent l="0" t="0" r="4445" b="0"/>
-            <wp:docPr id="10" name="Picture 10"/>
+          <wp:inline distT="0" distB="0" distL="0" distR="0" wp14:anchorId="1877DD5E" wp14:editId="05EFEC2D">
+            <wp:extent cx="5725834" cy="1319514"/>
+            <wp:effectExtent l="0" t="0" r="0" b="0"/>
+            <wp:docPr id="9" name="Picture 9"/>
             <wp:cNvGraphicFramePr>
               <a:graphicFrameLocks xmlns:a="http://schemas.openxmlformats.org/drawingml/2006/main" noChangeAspect="1"/>
             </wp:cNvGraphicFramePr>
@@ -1296,7 +1213,7 @@
                   <pic:spPr>
                     <a:xfrm>
                       <a:off x="0" y="0"/>
-                      <a:ext cx="5758921" cy="1215651"/>
+                      <a:ext cx="5786978" cy="1333605"/>
                     </a:xfrm>
                     <a:prstGeom prst="rect">
                       <a:avLst/>
@@ -1311,10 +1228,9 @@
     </w:p>
     <w:p>
       <w:pPr>
-        <w:rPr>
-          <w:rFonts w:ascii="Times New Roman" w:eastAsia="Times New Roman" w:hAnsi="Times New Roman" w:cs="Times New Roman"/>
-          <w:b/>
-          <w:bCs/>
+        <w:spacing w:after="0" w:line="240" w:lineRule="auto"/>
+        <w:rPr>
+          <w:rFonts w:ascii="Times New Roman" w:eastAsia="Times New Roman" w:hAnsi="Times New Roman" w:cs="Times New Roman"/>
           <w:sz w:val="24"/>
           <w:szCs w:val="24"/>
           <w:lang w:eastAsia="en-IN" w:bidi="mr-IN"/>
@@ -1328,6 +1244,7 @@
           <w:szCs w:val="24"/>
           <w:lang w:eastAsia="en-IN" w:bidi="mr-IN"/>
         </w:rPr>
+        <w:lastRenderedPageBreak/>
         <w:t></w:t>
       </w:r>
       <w:r>
@@ -1360,25 +1277,41 @@
           <w:szCs w:val="24"/>
           <w:lang w:eastAsia="en-IN" w:bidi="mr-IN"/>
         </w:rPr>
-        <w:t xml:space="preserve"> departments sorted by average salary in ascending order.</w:t>
-      </w:r>
-    </w:p>
-    <w:p>
-      <w:pPr>
-        <w:rPr>
-          <w:lang w:val="en-US"/>
-        </w:rPr>
-      </w:pPr>
-      <w:r>
-        <w:rPr>
+        <w:t xml:space="preserve"> departments 1 and 2 whose average salary is greater than 30000.</w:t>
+      </w:r>
+      <w:r>
+        <w:rPr>
+          <w:rFonts w:ascii="Times New Roman" w:eastAsia="Times New Roman" w:hAnsi="Times New Roman" w:cs="Times New Roman"/>
+          <w:sz w:val="24"/>
+          <w:szCs w:val="24"/>
+          <w:lang w:eastAsia="en-IN" w:bidi="mr-IN"/>
+        </w:rPr>
+        <w:t xml:space="preserve"> </w:t>
+      </w:r>
+    </w:p>
+    <w:p>
+      <w:pPr>
+        <w:spacing w:after="0" w:line="240" w:lineRule="auto"/>
+        <w:rPr>
+          <w:rFonts w:ascii="Times New Roman" w:eastAsia="Times New Roman" w:hAnsi="Times New Roman" w:cs="Times New Roman"/>
+          <w:sz w:val="24"/>
+          <w:szCs w:val="24"/>
+          <w:lang w:eastAsia="en-IN" w:bidi="mr-IN"/>
+        </w:rPr>
+      </w:pPr>
+      <w:r>
+        <w:rPr>
+          <w:rFonts w:ascii="Times New Roman" w:eastAsia="Times New Roman" w:hAnsi="Times New Roman" w:cs="Times New Roman"/>
           <w:noProof/>
-          <w:lang w:val="en-US"/>
+          <w:sz w:val="24"/>
+          <w:szCs w:val="24"/>
+          <w:lang w:eastAsia="en-IN" w:bidi="mr-IN"/>
         </w:rPr>
         <w:drawing>
-          <wp:inline distT="0" distB="0" distL="0" distR="0" wp14:anchorId="297EF516" wp14:editId="2B2CAD28">
-            <wp:extent cx="5729272" cy="1325301"/>
-            <wp:effectExtent l="0" t="0" r="5080" b="8255"/>
-            <wp:docPr id="12" name="Picture 12"/>
+          <wp:inline distT="0" distB="0" distL="0" distR="0" wp14:anchorId="1E3F903A" wp14:editId="76A8890C">
+            <wp:extent cx="5730040" cy="1209554"/>
+            <wp:effectExtent l="0" t="0" r="4445" b="0"/>
+            <wp:docPr id="10" name="Picture 10"/>
             <wp:cNvGraphicFramePr>
               <a:graphicFrameLocks xmlns:a="http://schemas.openxmlformats.org/drawingml/2006/main" noChangeAspect="1"/>
             </wp:cNvGraphicFramePr>
@@ -1398,7 +1331,7 @@
                   <pic:spPr>
                     <a:xfrm>
                       <a:off x="0" y="0"/>
-                      <a:ext cx="5762991" cy="1333101"/>
+                      <a:ext cx="5758921" cy="1215651"/>
                     </a:xfrm>
                     <a:prstGeom prst="rect">
                       <a:avLst/>
@@ -1414,216 +1347,73 @@
     <w:p>
       <w:pPr>
         <w:rPr>
-          <w:b/>
-          <w:bCs/>
-          <w:color w:val="000000" w:themeColor="text1"/>
-          <w:sz w:val="40"/>
-          <w:szCs w:val="40"/>
+          <w:rFonts w:ascii="Times New Roman" w:eastAsia="Times New Roman" w:hAnsi="Times New Roman" w:cs="Times New Roman"/>
+          <w:b/>
+          <w:bCs/>
+          <w:sz w:val="24"/>
+          <w:szCs w:val="24"/>
+          <w:lang w:eastAsia="en-IN" w:bidi="mr-IN"/>
+        </w:rPr>
+      </w:pPr>
+      <w:proofErr w:type="gramStart"/>
+      <w:r>
+        <w:rPr>
+          <w:rFonts w:ascii="Times New Roman" w:eastAsia="Times New Roman" w:hAnsi="Symbol" w:cs="Times New Roman"/>
+          <w:sz w:val="24"/>
+          <w:szCs w:val="24"/>
+          <w:lang w:eastAsia="en-IN" w:bidi="mr-IN"/>
+        </w:rPr>
+        <w:t></w:t>
+      </w:r>
+      <w:r>
+        <w:rPr>
+          <w:rFonts w:ascii="Times New Roman" w:eastAsia="Times New Roman" w:hAnsi="Times New Roman" w:cs="Times New Roman"/>
+          <w:sz w:val="24"/>
+          <w:szCs w:val="24"/>
+          <w:lang w:eastAsia="en-IN" w:bidi="mr-IN"/>
+        </w:rPr>
+        <w:t xml:space="preserve">  </w:t>
+      </w:r>
+      <w:r>
+        <w:rPr>
+          <w:rFonts w:ascii="Times New Roman" w:eastAsia="Times New Roman" w:hAnsi="Times New Roman" w:cs="Times New Roman"/>
+          <w:b/>
+          <w:bCs/>
+          <w:sz w:val="24"/>
+          <w:szCs w:val="24"/>
+          <w:lang w:eastAsia="en-IN" w:bidi="mr-IN"/>
+        </w:rPr>
+        <w:t>Display</w:t>
+      </w:r>
+      <w:proofErr w:type="gramEnd"/>
+      <w:r>
+        <w:rPr>
+          <w:rFonts w:ascii="Times New Roman" w:eastAsia="Times New Roman" w:hAnsi="Times New Roman" w:cs="Times New Roman"/>
+          <w:b/>
+          <w:bCs/>
+          <w:sz w:val="24"/>
+          <w:szCs w:val="24"/>
+          <w:lang w:eastAsia="en-IN" w:bidi="mr-IN"/>
+        </w:rPr>
+        <w:t xml:space="preserve"> departments sorted by average salary in ascending order.</w:t>
+      </w:r>
+    </w:p>
+    <w:p>
+      <w:pPr>
+        <w:rPr>
           <w:lang w:val="en-US"/>
         </w:rPr>
       </w:pPr>
       <w:r>
         <w:rPr>
-          <w:b/>
-          <w:bCs/>
-          <w:color w:val="FF0000"/>
-          <w:sz w:val="40"/>
-          <w:szCs w:val="40"/>
+          <w:noProof/>
           <w:lang w:val="en-US"/>
         </w:rPr>
-        <w:lastRenderedPageBreak/>
-        <w:t>16__</w:t>
-      </w:r>
-      <w:r>
-        <w:rPr>
-          <w:b/>
-          <w:bCs/>
-          <w:color w:val="FF0000"/>
-          <w:sz w:val="40"/>
-          <w:szCs w:val="40"/>
-          <w:lang w:val="en-US"/>
-        </w:rPr>
-        <w:t xml:space="preserve">GROUP </w:t>
-      </w:r>
-      <w:proofErr w:type="gramStart"/>
-      <w:r>
-        <w:rPr>
-          <w:b/>
-          <w:bCs/>
-          <w:color w:val="FF0000"/>
-          <w:sz w:val="40"/>
-          <w:szCs w:val="40"/>
-          <w:lang w:val="en-US"/>
-        </w:rPr>
-        <w:t>BY(</w:t>
-      </w:r>
-      <w:proofErr w:type="gramEnd"/>
-      <w:r>
-        <w:rPr>
-          <w:b/>
-          <w:bCs/>
-          <w:color w:val="FF0000"/>
-          <w:sz w:val="40"/>
-          <w:szCs w:val="40"/>
-          <w:lang w:val="en-US"/>
-        </w:rPr>
-        <w:t>)</w:t>
-      </w:r>
-      <w:r>
-        <w:rPr>
-          <w:b/>
-          <w:bCs/>
-          <w:color w:val="FF0000"/>
-          <w:sz w:val="40"/>
-          <w:szCs w:val="40"/>
-          <w:lang w:val="en-US"/>
-        </w:rPr>
-        <w:t xml:space="preserve"> </w:t>
-      </w:r>
-      <w:r>
-        <w:rPr>
-          <w:b/>
-          <w:bCs/>
-          <w:color w:val="000000" w:themeColor="text1"/>
-          <w:sz w:val="40"/>
-          <w:szCs w:val="40"/>
-          <w:lang w:val="en-US"/>
-        </w:rPr>
-        <w:t xml:space="preserve">and </w:t>
-      </w:r>
-      <w:r>
-        <w:rPr>
-          <w:b/>
-          <w:bCs/>
-          <w:color w:val="FF0000"/>
-          <w:sz w:val="40"/>
-          <w:szCs w:val="40"/>
-          <w:lang w:val="en-US"/>
-        </w:rPr>
-        <w:t>ORDER BY()</w:t>
-      </w:r>
-      <w:r>
-        <w:rPr>
-          <w:b/>
-          <w:bCs/>
-          <w:color w:val="FF0000"/>
-          <w:sz w:val="40"/>
-          <w:szCs w:val="40"/>
-          <w:lang w:val="en-US"/>
-        </w:rPr>
-        <w:t xml:space="preserve"> </w:t>
-      </w:r>
-      <w:r>
-        <w:rPr>
-          <w:b/>
-          <w:bCs/>
-          <w:color w:val="000000" w:themeColor="text1"/>
-          <w:sz w:val="40"/>
-          <w:szCs w:val="40"/>
-          <w:lang w:val="en-US"/>
-        </w:rPr>
-        <w:t>and</w:t>
-      </w:r>
-      <w:r>
-        <w:rPr>
-          <w:b/>
-          <w:bCs/>
-          <w:color w:val="000000" w:themeColor="text1"/>
-          <w:sz w:val="40"/>
-          <w:szCs w:val="40"/>
-          <w:lang w:val="en-US"/>
-        </w:rPr>
-        <w:t xml:space="preserve"> </w:t>
-      </w:r>
-      <w:r>
-        <w:rPr>
-          <w:b/>
-          <w:bCs/>
-          <w:color w:val="FF0000"/>
-          <w:sz w:val="40"/>
-          <w:szCs w:val="40"/>
-          <w:lang w:val="en-US"/>
-        </w:rPr>
-        <w:t>SUB-QUERY()</w:t>
-      </w:r>
-      <w:r>
-        <w:rPr>
-          <w:b/>
-          <w:bCs/>
-          <w:color w:val="000000" w:themeColor="text1"/>
-          <w:sz w:val="40"/>
-          <w:szCs w:val="40"/>
-          <w:lang w:val="en-US"/>
-        </w:rPr>
-        <w:t xml:space="preserve"> </w:t>
-      </w:r>
-      <w:r>
-        <w:rPr>
-          <w:b/>
-          <w:bCs/>
-          <w:color w:val="FF0000"/>
-          <w:sz w:val="40"/>
-          <w:szCs w:val="40"/>
-          <w:lang w:val="en-US"/>
-        </w:rPr>
-        <w:t>:</w:t>
-      </w:r>
-    </w:p>
-    <w:p>
-      <w:pPr>
-        <w:rPr>
-          <w:lang w:val="en-US"/>
-        </w:rPr>
-      </w:pPr>
-    </w:p>
-    <w:p>
-      <w:pPr>
-        <w:numPr>
-          <w:ilvl w:val="0"/>
-          <w:numId w:val="1"/>
-        </w:numPr>
-        <w:spacing w:before="100" w:beforeAutospacing="1" w:after="100" w:afterAutospacing="1" w:line="240" w:lineRule="auto"/>
-        <w:rPr>
-          <w:rFonts w:ascii="Times New Roman" w:eastAsia="Times New Roman" w:hAnsi="Times New Roman" w:cs="Times New Roman"/>
-          <w:sz w:val="24"/>
-          <w:szCs w:val="24"/>
-          <w:lang w:eastAsia="en-IN" w:bidi="mr-IN"/>
-        </w:rPr>
-      </w:pPr>
-      <w:r>
-        <w:rPr>
-          <w:rFonts w:ascii="Times New Roman" w:eastAsia="Times New Roman" w:hAnsi="Times New Roman" w:cs="Times New Roman"/>
-          <w:sz w:val="24"/>
-          <w:szCs w:val="24"/>
-          <w:lang w:eastAsia="en-IN" w:bidi="mr-IN"/>
-        </w:rPr>
-        <w:t xml:space="preserve">Find the name of the employee who has the highest salary. </w:t>
-      </w:r>
-    </w:p>
-    <w:p>
-      <w:pPr>
-        <w:spacing w:before="100" w:beforeAutospacing="1" w:after="100" w:afterAutospacing="1" w:line="240" w:lineRule="auto"/>
-        <w:ind w:left="720"/>
-        <w:rPr>
-          <w:rFonts w:ascii="Times New Roman" w:eastAsia="Times New Roman" w:hAnsi="Times New Roman" w:cs="Times New Roman"/>
-          <w:sz w:val="24"/>
-          <w:szCs w:val="24"/>
-          <w:lang w:eastAsia="en-IN" w:bidi="mr-IN"/>
-        </w:rPr>
-      </w:pPr>
-      <w:r>
-        <w:rPr>
-          <w:rFonts w:ascii="Times New Roman" w:eastAsia="Times New Roman" w:hAnsi="Times New Roman" w:cs="Times New Roman"/>
-          <w:noProof/>
-          <w:sz w:val="24"/>
-          <w:szCs w:val="24"/>
-          <w:lang w:eastAsia="en-IN" w:bidi="mr-IN"/>
-        </w:rPr>
         <w:drawing>
-          <wp:inline distT="0" distB="0" distL="0" distR="0" wp14:anchorId="196B3B11" wp14:editId="523DEB84">
-            <wp:extent cx="5731510" cy="1634490"/>
-            <wp:effectExtent l="0" t="0" r="2540" b="3810"/>
-            <wp:docPr id="13" name="Picture 13"/>
+          <wp:inline distT="0" distB="0" distL="0" distR="0" wp14:anchorId="297EF516" wp14:editId="2B2CAD28">
+            <wp:extent cx="5729272" cy="1325301"/>
+            <wp:effectExtent l="0" t="0" r="5080" b="8255"/>
+            <wp:docPr id="12" name="Picture 12"/>
             <wp:cNvGraphicFramePr>
               <a:graphicFrameLocks xmlns:a="http://schemas.openxmlformats.org/drawingml/2006/main" noChangeAspect="1"/>
             </wp:cNvGraphicFramePr>
@@ -1643,7 +1433,7 @@
                   <pic:spPr>
                     <a:xfrm>
                       <a:off x="0" y="0"/>
-                      <a:ext cx="5731510" cy="1634490"/>
+                      <a:ext cx="5762991" cy="1333101"/>
                     </a:xfrm>
                     <a:prstGeom prst="rect">
                       <a:avLst/>
@@ -1658,6 +1448,170 @@
     </w:p>
     <w:p>
       <w:pPr>
+        <w:rPr>
+          <w:b/>
+          <w:bCs/>
+          <w:color w:val="000000" w:themeColor="text1"/>
+          <w:sz w:val="40"/>
+          <w:szCs w:val="40"/>
+          <w:lang w:val="en-US"/>
+        </w:rPr>
+      </w:pPr>
+      <w:r>
+        <w:rPr>
+          <w:b/>
+          <w:bCs/>
+          <w:color w:val="FF0000"/>
+          <w:sz w:val="40"/>
+          <w:szCs w:val="40"/>
+          <w:lang w:val="en-US"/>
+        </w:rPr>
+        <w:t>16__</w:t>
+      </w:r>
+      <w:r>
+        <w:rPr>
+          <w:b/>
+          <w:bCs/>
+          <w:color w:val="FF0000"/>
+          <w:sz w:val="40"/>
+          <w:szCs w:val="40"/>
+          <w:lang w:val="en-US"/>
+        </w:rPr>
+        <w:t xml:space="preserve">GROUP </w:t>
+      </w:r>
+      <w:proofErr w:type="gramStart"/>
+      <w:r>
+        <w:rPr>
+          <w:b/>
+          <w:bCs/>
+          <w:color w:val="FF0000"/>
+          <w:sz w:val="40"/>
+          <w:szCs w:val="40"/>
+          <w:lang w:val="en-US"/>
+        </w:rPr>
+        <w:t>BY(</w:t>
+      </w:r>
+      <w:proofErr w:type="gramEnd"/>
+      <w:r>
+        <w:rPr>
+          <w:b/>
+          <w:bCs/>
+          <w:color w:val="FF0000"/>
+          <w:sz w:val="40"/>
+          <w:szCs w:val="40"/>
+          <w:lang w:val="en-US"/>
+        </w:rPr>
+        <w:t>)</w:t>
+      </w:r>
+      <w:r>
+        <w:rPr>
+          <w:b/>
+          <w:bCs/>
+          <w:color w:val="FF0000"/>
+          <w:sz w:val="40"/>
+          <w:szCs w:val="40"/>
+          <w:lang w:val="en-US"/>
+        </w:rPr>
+        <w:t xml:space="preserve"> </w:t>
+      </w:r>
+      <w:r>
+        <w:rPr>
+          <w:b/>
+          <w:bCs/>
+          <w:color w:val="000000" w:themeColor="text1"/>
+          <w:sz w:val="40"/>
+          <w:szCs w:val="40"/>
+          <w:lang w:val="en-US"/>
+        </w:rPr>
+        <w:t xml:space="preserve">and </w:t>
+      </w:r>
+      <w:r>
+        <w:rPr>
+          <w:b/>
+          <w:bCs/>
+          <w:color w:val="FF0000"/>
+          <w:sz w:val="40"/>
+          <w:szCs w:val="40"/>
+          <w:lang w:val="en-US"/>
+        </w:rPr>
+        <w:t>ORDER BY()</w:t>
+      </w:r>
+      <w:r>
+        <w:rPr>
+          <w:b/>
+          <w:bCs/>
+          <w:color w:val="FF0000"/>
+          <w:sz w:val="40"/>
+          <w:szCs w:val="40"/>
+          <w:lang w:val="en-US"/>
+        </w:rPr>
+        <w:t xml:space="preserve"> </w:t>
+      </w:r>
+      <w:r>
+        <w:rPr>
+          <w:b/>
+          <w:bCs/>
+          <w:color w:val="000000" w:themeColor="text1"/>
+          <w:sz w:val="40"/>
+          <w:szCs w:val="40"/>
+          <w:lang w:val="en-US"/>
+        </w:rPr>
+        <w:t>and</w:t>
+      </w:r>
+      <w:r>
+        <w:rPr>
+          <w:b/>
+          <w:bCs/>
+          <w:color w:val="000000" w:themeColor="text1"/>
+          <w:sz w:val="40"/>
+          <w:szCs w:val="40"/>
+          <w:lang w:val="en-US"/>
+        </w:rPr>
+        <w:t xml:space="preserve"> </w:t>
+      </w:r>
+      <w:r>
+        <w:rPr>
+          <w:b/>
+          <w:bCs/>
+          <w:color w:val="FF0000"/>
+          <w:sz w:val="40"/>
+          <w:szCs w:val="40"/>
+          <w:lang w:val="en-US"/>
+        </w:rPr>
+        <w:t>SUB-QUERY()</w:t>
+      </w:r>
+      <w:r>
+        <w:rPr>
+          <w:b/>
+          <w:bCs/>
+          <w:color w:val="000000" w:themeColor="text1"/>
+          <w:sz w:val="40"/>
+          <w:szCs w:val="40"/>
+          <w:lang w:val="en-US"/>
+        </w:rPr>
+        <w:t xml:space="preserve"> </w:t>
+      </w:r>
+      <w:r>
+        <w:rPr>
+          <w:b/>
+          <w:bCs/>
+          <w:color w:val="FF0000"/>
+          <w:sz w:val="40"/>
+          <w:szCs w:val="40"/>
+          <w:lang w:val="en-US"/>
+        </w:rPr>
+        <w:t>:</w:t>
+      </w:r>
+    </w:p>
+    <w:p>
+      <w:pPr>
+        <w:rPr>
+          <w:lang w:val="en-US"/>
+        </w:rPr>
+      </w:pPr>
+    </w:p>
+    <w:p>
+      <w:pPr>
         <w:numPr>
           <w:ilvl w:val="0"/>
           <w:numId w:val="1"/>
@@ -1677,7 +1631,7 @@
           <w:szCs w:val="24"/>
           <w:lang w:eastAsia="en-IN" w:bidi="mr-IN"/>
         </w:rPr>
-        <w:t xml:space="preserve">Find the names of employees whose salary is greater than the average salary of all employees. </w:t>
+        <w:t xml:space="preserve">Find the name of the employee who has the highest salary. </w:t>
       </w:r>
     </w:p>
     <w:p>
@@ -1700,10 +1654,10 @@
           <w:lang w:eastAsia="en-IN" w:bidi="mr-IN"/>
         </w:rPr>
         <w:drawing>
-          <wp:inline distT="0" distB="0" distL="0" distR="0" wp14:anchorId="7D9F670C" wp14:editId="7B2B9611">
-            <wp:extent cx="5729740" cy="1603094"/>
-            <wp:effectExtent l="0" t="0" r="4445" b="0"/>
-            <wp:docPr id="14" name="Picture 14"/>
+          <wp:inline distT="0" distB="0" distL="0" distR="0" wp14:anchorId="196B3B11" wp14:editId="523DEB84">
+            <wp:extent cx="5731510" cy="1634490"/>
+            <wp:effectExtent l="0" t="0" r="2540" b="3810"/>
+            <wp:docPr id="13" name="Picture 13"/>
             <wp:cNvGraphicFramePr>
               <a:graphicFrameLocks xmlns:a="http://schemas.openxmlformats.org/drawingml/2006/main" noChangeAspect="1"/>
             </wp:cNvGraphicFramePr>
@@ -1723,7 +1677,7 @@
                   <pic:spPr>
                     <a:xfrm>
                       <a:off x="0" y="0"/>
-                      <a:ext cx="5749181" cy="1608533"/>
+                      <a:ext cx="5731510" cy="1634490"/>
                     </a:xfrm>
                     <a:prstGeom prst="rect">
                       <a:avLst/>
@@ -1757,7 +1711,7 @@
           <w:szCs w:val="24"/>
           <w:lang w:eastAsia="en-IN" w:bidi="mr-IN"/>
         </w:rPr>
-        <w:t xml:space="preserve">Find the names of employees who work in the HR department. </w:t>
+        <w:t xml:space="preserve">Find the names of employees whose salary is greater than the average salary of all employees. </w:t>
       </w:r>
     </w:p>
     <w:p>
@@ -1780,10 +1734,10 @@
           <w:lang w:eastAsia="en-IN" w:bidi="mr-IN"/>
         </w:rPr>
         <w:drawing>
-          <wp:inline distT="0" distB="0" distL="0" distR="0" wp14:anchorId="79991638" wp14:editId="3B20DD8D">
-            <wp:extent cx="5731510" cy="3211975"/>
-            <wp:effectExtent l="0" t="0" r="2540" b="7620"/>
-            <wp:docPr id="15" name="Picture 15"/>
+          <wp:inline distT="0" distB="0" distL="0" distR="0" wp14:anchorId="7D9F670C" wp14:editId="7B2B9611">
+            <wp:extent cx="5729740" cy="1603094"/>
+            <wp:effectExtent l="0" t="0" r="4445" b="0"/>
+            <wp:docPr id="14" name="Picture 14"/>
             <wp:cNvGraphicFramePr>
               <a:graphicFrameLocks xmlns:a="http://schemas.openxmlformats.org/drawingml/2006/main" noChangeAspect="1"/>
             </wp:cNvGraphicFramePr>
@@ -1803,7 +1757,7 @@
                   <pic:spPr>
                     <a:xfrm>
                       <a:off x="0" y="0"/>
-                      <a:ext cx="5738834" cy="3216079"/>
+                      <a:ext cx="5749181" cy="1608533"/>
                     </a:xfrm>
                     <a:prstGeom prst="rect">
                       <a:avLst/>
@@ -1837,8 +1791,7 @@
           <w:szCs w:val="24"/>
           <w:lang w:eastAsia="en-IN" w:bidi="mr-IN"/>
         </w:rPr>
-        <w:lastRenderedPageBreak/>
-        <w:t xml:space="preserve">Find the department name in which the employee with the highest salary works. </w:t>
+        <w:t xml:space="preserve">Find the names of employees who work in the HR department. </w:t>
       </w:r>
     </w:p>
     <w:p>
@@ -1860,11 +1813,12 @@
           <w:szCs w:val="24"/>
           <w:lang w:eastAsia="en-IN" w:bidi="mr-IN"/>
         </w:rPr>
+        <w:lastRenderedPageBreak/>
         <w:drawing>
-          <wp:inline distT="0" distB="0" distL="0" distR="0" wp14:anchorId="5EC679A9" wp14:editId="43D8C766">
-            <wp:extent cx="5731510" cy="2534856"/>
-            <wp:effectExtent l="0" t="0" r="2540" b="0"/>
-            <wp:docPr id="16" name="Picture 16"/>
+          <wp:inline distT="0" distB="0" distL="0" distR="0" wp14:anchorId="79991638" wp14:editId="3B20DD8D">
+            <wp:extent cx="5731510" cy="3211975"/>
+            <wp:effectExtent l="0" t="0" r="2540" b="7620"/>
+            <wp:docPr id="15" name="Picture 15"/>
             <wp:cNvGraphicFramePr>
               <a:graphicFrameLocks xmlns:a="http://schemas.openxmlformats.org/drawingml/2006/main" noChangeAspect="1"/>
             </wp:cNvGraphicFramePr>
@@ -1884,7 +1838,7 @@
                   <pic:spPr>
                     <a:xfrm>
                       <a:off x="0" y="0"/>
-                      <a:ext cx="5741870" cy="2539438"/>
+                      <a:ext cx="5738834" cy="3216079"/>
                     </a:xfrm>
                     <a:prstGeom prst="rect">
                       <a:avLst/>
@@ -1918,7 +1872,7 @@
           <w:szCs w:val="24"/>
           <w:lang w:eastAsia="en-IN" w:bidi="mr-IN"/>
         </w:rPr>
-        <w:t xml:space="preserve">Find the names of employees who work in departments located in Pune. </w:t>
+        <w:t xml:space="preserve">Find the department name in which the employee with the highest salary works. </w:t>
       </w:r>
     </w:p>
     <w:p>
@@ -1941,10 +1895,10 @@
           <w:lang w:eastAsia="en-IN" w:bidi="mr-IN"/>
         </w:rPr>
         <w:drawing>
-          <wp:inline distT="0" distB="0" distL="0" distR="0" wp14:anchorId="7CDE3120" wp14:editId="551421C4">
-            <wp:extent cx="5731510" cy="4971327"/>
-            <wp:effectExtent l="0" t="0" r="2540" b="1270"/>
-            <wp:docPr id="18" name="Picture 18"/>
+          <wp:inline distT="0" distB="0" distL="0" distR="0" wp14:anchorId="5EC679A9" wp14:editId="43D8C766">
+            <wp:extent cx="5731510" cy="2534856"/>
+            <wp:effectExtent l="0" t="0" r="2540" b="0"/>
+            <wp:docPr id="16" name="Picture 16"/>
             <wp:cNvGraphicFramePr>
               <a:graphicFrameLocks xmlns:a="http://schemas.openxmlformats.org/drawingml/2006/main" noChangeAspect="1"/>
             </wp:cNvGraphicFramePr>
@@ -1964,7 +1918,7 @@
                   <pic:spPr>
                     <a:xfrm>
                       <a:off x="0" y="0"/>
-                      <a:ext cx="5733704" cy="4973230"/>
+                      <a:ext cx="5741870" cy="2539438"/>
                     </a:xfrm>
                     <a:prstGeom prst="rect">
                       <a:avLst/>
@@ -1979,59 +1933,9 @@
     </w:p>
     <w:p>
       <w:pPr>
-        <w:spacing w:after="0" w:line="240" w:lineRule="auto"/>
-        <w:rPr>
-          <w:rFonts w:ascii="Times New Roman" w:eastAsia="Times New Roman" w:hAnsi="Times New Roman" w:cs="Times New Roman"/>
-          <w:sz w:val="24"/>
-          <w:szCs w:val="24"/>
-          <w:lang w:eastAsia="en-IN" w:bidi="mr-IN"/>
-        </w:rPr>
-      </w:pPr>
-      <w:r>
-        <w:rPr>
-          <w:rFonts w:ascii="Times New Roman" w:eastAsia="Times New Roman" w:hAnsi="Times New Roman" w:cs="Times New Roman"/>
-          <w:sz w:val="24"/>
-          <w:szCs w:val="24"/>
-          <w:lang w:eastAsia="en-IN" w:bidi="mr-IN"/>
-        </w:rPr>
-        <w:pict>
-          <v:rect id="_x0000_i1025" style="width:0;height:1.5pt" o:hralign="center" o:hrstd="t" o:hr="t" fillcolor="#a0a0a0" stroked="f"/>
-        </w:pict>
-      </w:r>
-    </w:p>
-    <w:p>
-      <w:pPr>
-        <w:spacing w:before="100" w:beforeAutospacing="1" w:after="100" w:afterAutospacing="1" w:line="240" w:lineRule="auto"/>
-        <w:outlineLvl w:val="0"/>
-        <w:rPr>
-          <w:rFonts w:ascii="Times New Roman" w:eastAsia="Times New Roman" w:hAnsi="Times New Roman" w:cs="Times New Roman"/>
-          <w:b/>
-          <w:bCs/>
-          <w:kern w:val="36"/>
-          <w:sz w:val="28"/>
-          <w:szCs w:val="28"/>
-          <w:lang w:eastAsia="en-IN" w:bidi="mr-IN"/>
-        </w:rPr>
-      </w:pPr>
-      <w:r>
-        <w:rPr>
-          <w:rFonts w:ascii="Times New Roman" w:eastAsia="Times New Roman" w:hAnsi="Times New Roman" w:cs="Times New Roman"/>
-          <w:b/>
-          <w:bCs/>
-          <w:kern w:val="36"/>
-          <w:sz w:val="28"/>
-          <w:szCs w:val="28"/>
-          <w:lang w:eastAsia="en-IN" w:bidi="mr-IN"/>
-        </w:rPr>
-        <w:lastRenderedPageBreak/>
-        <w:t>GROUP BY with Multiple Columns — Practice Questions</w:t>
-      </w:r>
-    </w:p>
-    <w:p>
-      <w:pPr>
         <w:numPr>
           <w:ilvl w:val="0"/>
-          <w:numId w:val="2"/>
+          <w:numId w:val="1"/>
         </w:numPr>
         <w:spacing w:before="100" w:beforeAutospacing="1" w:after="100" w:afterAutospacing="1" w:line="240" w:lineRule="auto"/>
         <w:rPr>
@@ -2048,7 +1952,7 @@
           <w:szCs w:val="24"/>
           <w:lang w:eastAsia="en-IN" w:bidi="mr-IN"/>
         </w:rPr>
-        <w:t xml:space="preserve">Find the number of employees in each city and department. </w:t>
+        <w:t xml:space="preserve">Find the names of employees who work in departments located in Pune. </w:t>
       </w:r>
     </w:p>
     <w:p>
@@ -2070,11 +1974,12 @@
           <w:szCs w:val="24"/>
           <w:lang w:eastAsia="en-IN" w:bidi="mr-IN"/>
         </w:rPr>
+        <w:lastRenderedPageBreak/>
         <w:drawing>
-          <wp:inline distT="0" distB="0" distL="0" distR="0" wp14:anchorId="0AD32EFA" wp14:editId="5B959A3F">
-            <wp:extent cx="5729226" cy="1828800"/>
-            <wp:effectExtent l="0" t="0" r="5080" b="0"/>
-            <wp:docPr id="20" name="Picture 20"/>
+          <wp:inline distT="0" distB="0" distL="0" distR="0" wp14:anchorId="7CDE3120" wp14:editId="551421C4">
+            <wp:extent cx="5731510" cy="4971327"/>
+            <wp:effectExtent l="0" t="0" r="2540" b="1270"/>
+            <wp:docPr id="18" name="Picture 18"/>
             <wp:cNvGraphicFramePr>
               <a:graphicFrameLocks xmlns:a="http://schemas.openxmlformats.org/drawingml/2006/main" noChangeAspect="1"/>
             </wp:cNvGraphicFramePr>
@@ -2094,6 +1999,135 @@
                   <pic:spPr>
                     <a:xfrm>
                       <a:off x="0" y="0"/>
+                      <a:ext cx="5733704" cy="4973230"/>
+                    </a:xfrm>
+                    <a:prstGeom prst="rect">
+                      <a:avLst/>
+                    </a:prstGeom>
+                  </pic:spPr>
+                </pic:pic>
+              </a:graphicData>
+            </a:graphic>
+          </wp:inline>
+        </w:drawing>
+      </w:r>
+    </w:p>
+    <w:p>
+      <w:pPr>
+        <w:spacing w:after="0" w:line="240" w:lineRule="auto"/>
+        <w:rPr>
+          <w:rFonts w:ascii="Times New Roman" w:eastAsia="Times New Roman" w:hAnsi="Times New Roman" w:cs="Times New Roman"/>
+          <w:sz w:val="24"/>
+          <w:szCs w:val="24"/>
+          <w:lang w:eastAsia="en-IN" w:bidi="mr-IN"/>
+        </w:rPr>
+      </w:pPr>
+      <w:r>
+        <w:rPr>
+          <w:rFonts w:ascii="Times New Roman" w:eastAsia="Times New Roman" w:hAnsi="Times New Roman" w:cs="Times New Roman"/>
+          <w:sz w:val="24"/>
+          <w:szCs w:val="24"/>
+          <w:lang w:eastAsia="en-IN" w:bidi="mr-IN"/>
+        </w:rPr>
+        <w:pict>
+          <v:rect id="_x0000_i1025" style="width:0;height:1.5pt" o:hralign="center" o:hrstd="t" o:hr="t" fillcolor="#a0a0a0" stroked="f"/>
+        </w:pict>
+      </w:r>
+    </w:p>
+    <w:p>
+      <w:pPr>
+        <w:spacing w:before="100" w:beforeAutospacing="1" w:after="100" w:afterAutospacing="1" w:line="240" w:lineRule="auto"/>
+        <w:outlineLvl w:val="0"/>
+        <w:rPr>
+          <w:rFonts w:ascii="Times New Roman" w:eastAsia="Times New Roman" w:hAnsi="Times New Roman" w:cs="Times New Roman"/>
+          <w:b/>
+          <w:bCs/>
+          <w:kern w:val="36"/>
+          <w:sz w:val="28"/>
+          <w:szCs w:val="28"/>
+          <w:lang w:eastAsia="en-IN" w:bidi="mr-IN"/>
+        </w:rPr>
+      </w:pPr>
+      <w:r>
+        <w:rPr>
+          <w:rFonts w:ascii="Times New Roman" w:eastAsia="Times New Roman" w:hAnsi="Times New Roman" w:cs="Times New Roman"/>
+          <w:b/>
+          <w:bCs/>
+          <w:kern w:val="36"/>
+          <w:sz w:val="28"/>
+          <w:szCs w:val="28"/>
+          <w:lang w:eastAsia="en-IN" w:bidi="mr-IN"/>
+        </w:rPr>
+        <w:t>GROUP BY with Multiple Columns — Practice Questions</w:t>
+      </w:r>
+    </w:p>
+    <w:p>
+      <w:pPr>
+        <w:numPr>
+          <w:ilvl w:val="0"/>
+          <w:numId w:val="2"/>
+        </w:numPr>
+        <w:spacing w:before="100" w:beforeAutospacing="1" w:after="100" w:afterAutospacing="1" w:line="240" w:lineRule="auto"/>
+        <w:rPr>
+          <w:rFonts w:ascii="Times New Roman" w:eastAsia="Times New Roman" w:hAnsi="Times New Roman" w:cs="Times New Roman"/>
+          <w:sz w:val="24"/>
+          <w:szCs w:val="24"/>
+          <w:lang w:eastAsia="en-IN" w:bidi="mr-IN"/>
+        </w:rPr>
+      </w:pPr>
+      <w:r>
+        <w:rPr>
+          <w:rFonts w:ascii="Times New Roman" w:eastAsia="Times New Roman" w:hAnsi="Times New Roman" w:cs="Times New Roman"/>
+          <w:sz w:val="24"/>
+          <w:szCs w:val="24"/>
+          <w:lang w:eastAsia="en-IN" w:bidi="mr-IN"/>
+        </w:rPr>
+        <w:t xml:space="preserve">Find the number of employees in each city and department. </w:t>
+      </w:r>
+    </w:p>
+    <w:p>
+      <w:pPr>
+        <w:spacing w:before="100" w:beforeAutospacing="1" w:after="100" w:afterAutospacing="1" w:line="240" w:lineRule="auto"/>
+        <w:ind w:left="720"/>
+        <w:rPr>
+          <w:rFonts w:ascii="Times New Roman" w:eastAsia="Times New Roman" w:hAnsi="Times New Roman" w:cs="Times New Roman"/>
+          <w:sz w:val="24"/>
+          <w:szCs w:val="24"/>
+          <w:lang w:eastAsia="en-IN" w:bidi="mr-IN"/>
+        </w:rPr>
+      </w:pPr>
+      <w:r>
+        <w:rPr>
+          <w:rFonts w:ascii="Times New Roman" w:eastAsia="Times New Roman" w:hAnsi="Times New Roman" w:cs="Times New Roman"/>
+          <w:noProof/>
+          <w:sz w:val="24"/>
+          <w:szCs w:val="24"/>
+          <w:lang w:eastAsia="en-IN" w:bidi="mr-IN"/>
+        </w:rPr>
+        <w:drawing>
+          <wp:inline distT="0" distB="0" distL="0" distR="0" wp14:anchorId="0AD32EFA" wp14:editId="5B959A3F">
+            <wp:extent cx="5729226" cy="1828800"/>
+            <wp:effectExtent l="0" t="0" r="5080" b="0"/>
+            <wp:docPr id="20" name="Picture 20"/>
+            <wp:cNvGraphicFramePr>
+              <a:graphicFrameLocks xmlns:a="http://schemas.openxmlformats.org/drawingml/2006/main" noChangeAspect="1"/>
+            </wp:cNvGraphicFramePr>
+            <a:graphic xmlns:a="http://schemas.openxmlformats.org/drawingml/2006/main">
+              <a:graphicData uri="http://schemas.openxmlformats.org/drawingml/2006/picture">
+                <pic:pic xmlns:pic="http://schemas.openxmlformats.org/drawingml/2006/picture">
+                  <pic:nvPicPr>
+                    <pic:cNvPr id="1" name=""/>
+                    <pic:cNvPicPr/>
+                  </pic:nvPicPr>
+                  <pic:blipFill>
+                    <a:blip r:embed="rId22"/>
+                    <a:stretch>
+                      <a:fillRect/>
+                    </a:stretch>
+                  </pic:blipFill>
+                  <pic:spPr>
+                    <a:xfrm>
+                      <a:off x="0" y="0"/>
                       <a:ext cx="5762002" cy="1839262"/>
                     </a:xfrm>
                     <a:prstGeom prst="rect">
@@ -2150,6 +2184,7 @@
           <w:szCs w:val="24"/>
           <w:lang w:eastAsia="en-IN" w:bidi="mr-IN"/>
         </w:rPr>
+        <w:lastRenderedPageBreak/>
         <w:drawing>
           <wp:inline distT="0" distB="0" distL="0" distR="0" wp14:anchorId="72F52D81" wp14:editId="42DF92B8">
             <wp:extent cx="5731510" cy="2563495"/>
@@ -2166,7 +2201,7 @@
                     <pic:cNvPicPr/>
                   </pic:nvPicPr>
                   <pic:blipFill>
-                    <a:blip r:embed="rId21"/>
+                    <a:blip r:embed="rId22"/>
                     <a:stretch>
                       <a:fillRect/>
                     </a:stretch>
@@ -2246,7 +2281,7 @@
                     <pic:cNvPicPr/>
                   </pic:nvPicPr>
                   <pic:blipFill>
-                    <a:blip r:embed="rId22"/>
+                    <a:blip r:embed="rId23"/>
                     <a:stretch>
                       <a:fillRect/>
                     </a:stretch>

</xml_diff>